<commit_message>
Reorganize project structure: move files to Misc directory
</commit_message>
<xml_diff>
--- a/ReportsAndDocuments/F25_4440_G12_worklogs - Akintunde.docx
+++ b/ReportsAndDocuments/F25_4440_G12_worklogs - Akintunde.docx
@@ -330,282 +330,6 @@
         </w:p>
       </w:sdtContent>
     </w:sdt>
-    <w:sdt>
-      <w:sdtPr>
-        <w:rPr>
-          <w:rFonts w:asciiTheme="minorHAnsi" w:eastAsiaTheme="minorEastAsia" w:hAnsiTheme="minorHAnsi" w:cstheme="minorBidi"/>
-          <w:b w:val="0"/>
-          <w:bCs w:val="0"/>
-          <w:smallCaps w:val="0"/>
-          <w:color w:val="auto"/>
-          <w:sz w:val="22"/>
-          <w:szCs w:val="22"/>
-        </w:rPr>
-        <w:id w:val="-1385091595"/>
-        <w:docPartObj>
-          <w:docPartGallery w:val="Table of Contents"/>
-          <w:docPartUnique/>
-        </w:docPartObj>
-      </w:sdtPr>
-      <w:sdtEndPr>
-        <w:rPr>
-          <w:noProof/>
-        </w:rPr>
-      </w:sdtEndPr>
-      <w:sdtContent>
-        <w:p>
-          <w:pPr>
-            <w:pStyle w:val="TOCHeading"/>
-            <w:numPr>
-              <w:ilvl w:val="0"/>
-              <w:numId w:val="0"/>
-            </w:numPr>
-            <w:ind w:left="432" w:hanging="432"/>
-            <w:jc w:val="both"/>
-          </w:pPr>
-          <w:r>
-            <w:t>Table of Contents</w:t>
-          </w:r>
-        </w:p>
-        <w:p>
-          <w:pPr>
-            <w:pStyle w:val="TOC1"/>
-            <w:tabs>
-              <w:tab w:val="left" w:pos="440"/>
-              <w:tab w:val="right" w:leader="dot" w:pos="9350"/>
-            </w:tabs>
-            <w:rPr>
-              <w:noProof/>
-              <w:kern w:val="2"/>
-              <w:sz w:val="24"/>
-              <w:szCs w:val="24"/>
-              <w:lang w:val="en-CA" w:eastAsia="en-CA"/>
-              <w14:ligatures w14:val="standardContextual"/>
-            </w:rPr>
-          </w:pPr>
-          <w:r>
-            <w:fldChar w:fldCharType="begin"/>
-          </w:r>
-          <w:r>
-            <w:instrText xml:space="preserve"> TOC \o "1-3" \h \z \u </w:instrText>
-          </w:r>
-          <w:r>
-            <w:fldChar w:fldCharType="separate"/>
-          </w:r>
-          <w:hyperlink w:anchor="_Toc212216302" w:history="1">
-            <w:r>
-              <w:rPr>
-                <w:rStyle w:val="Hyperlink"/>
-                <w:noProof/>
-              </w:rPr>
-              <w:t>1</w:t>
-            </w:r>
-            <w:r>
-              <w:rPr>
-                <w:noProof/>
-                <w:kern w:val="2"/>
-                <w:sz w:val="24"/>
-                <w:szCs w:val="24"/>
-                <w:lang w:val="en-CA" w:eastAsia="en-CA"/>
-                <w14:ligatures w14:val="standardContextual"/>
-              </w:rPr>
-              <w:tab/>
-            </w:r>
-            <w:r>
-              <w:rPr>
-                <w:rStyle w:val="Hyperlink"/>
-                <w:noProof/>
-              </w:rPr>
-              <w:t>WorkLog</w:t>
-            </w:r>
-            <w:r>
-              <w:rPr>
-                <w:noProof/>
-                <w:webHidden/>
-              </w:rPr>
-              <w:tab/>
-            </w:r>
-            <w:r>
-              <w:rPr>
-                <w:noProof/>
-                <w:webHidden/>
-              </w:rPr>
-              <w:fldChar w:fldCharType="begin"/>
-            </w:r>
-            <w:r>
-              <w:rPr>
-                <w:noProof/>
-                <w:webHidden/>
-              </w:rPr>
-              <w:instrText xml:space="preserve"> PAGEREF _Toc212216302 \h </w:instrText>
-            </w:r>
-            <w:r>
-              <w:rPr>
-                <w:noProof/>
-                <w:webHidden/>
-              </w:rPr>
-            </w:r>
-            <w:r>
-              <w:rPr>
-                <w:noProof/>
-                <w:webHidden/>
-              </w:rPr>
-              <w:fldChar w:fldCharType="separate"/>
-            </w:r>
-            <w:r>
-              <w:rPr>
-                <w:noProof/>
-                <w:webHidden/>
-              </w:rPr>
-              <w:t>2</w:t>
-            </w:r>
-            <w:r>
-              <w:rPr>
-                <w:noProof/>
-                <w:webHidden/>
-              </w:rPr>
-              <w:fldChar w:fldCharType="end"/>
-            </w:r>
-          </w:hyperlink>
-        </w:p>
-        <w:p>
-          <w:pPr>
-            <w:pStyle w:val="TOC1"/>
-            <w:tabs>
-              <w:tab w:val="left" w:pos="440"/>
-              <w:tab w:val="right" w:leader="dot" w:pos="9350"/>
-            </w:tabs>
-            <w:rPr>
-              <w:noProof/>
-              <w:kern w:val="2"/>
-              <w:sz w:val="24"/>
-              <w:szCs w:val="24"/>
-              <w:lang w:val="en-CA" w:eastAsia="en-CA"/>
-              <w14:ligatures w14:val="standardContextual"/>
-            </w:rPr>
-          </w:pPr>
-          <w:hyperlink w:anchor="_Toc212216303" w:history="1">
-            <w:r>
-              <w:rPr>
-                <w:rStyle w:val="Hyperlink"/>
-                <w:noProof/>
-              </w:rPr>
-              <w:t>2</w:t>
-            </w:r>
-            <w:r>
-              <w:rPr>
-                <w:noProof/>
-                <w:kern w:val="2"/>
-                <w:sz w:val="24"/>
-                <w:szCs w:val="24"/>
-                <w:lang w:val="en-CA" w:eastAsia="en-CA"/>
-                <w14:ligatures w14:val="standardContextual"/>
-              </w:rPr>
-              <w:tab/>
-            </w:r>
-            <w:r>
-              <w:rPr>
-                <w:rStyle w:val="Hyperlink"/>
-                <w:noProof/>
-              </w:rPr>
-              <w:t>Work Description Summary</w:t>
-            </w:r>
-            <w:r>
-              <w:rPr>
-                <w:noProof/>
-                <w:webHidden/>
-              </w:rPr>
-              <w:tab/>
-            </w:r>
-            <w:r>
-              <w:rPr>
-                <w:noProof/>
-                <w:webHidden/>
-              </w:rPr>
-              <w:fldChar w:fldCharType="begin"/>
-            </w:r>
-            <w:r>
-              <w:rPr>
-                <w:noProof/>
-                <w:webHidden/>
-              </w:rPr>
-              <w:instrText xml:space="preserve"> PAGEREF _Toc212216303 \h </w:instrText>
-            </w:r>
-            <w:r>
-              <w:rPr>
-                <w:noProof/>
-                <w:webHidden/>
-              </w:rPr>
-            </w:r>
-            <w:r>
-              <w:rPr>
-                <w:noProof/>
-                <w:webHidden/>
-              </w:rPr>
-              <w:fldChar w:fldCharType="separate"/>
-            </w:r>
-            <w:r>
-              <w:rPr>
-                <w:noProof/>
-                <w:webHidden/>
-              </w:rPr>
-              <w:t>2</w:t>
-            </w:r>
-            <w:r>
-              <w:rPr>
-                <w:noProof/>
-                <w:webHidden/>
-              </w:rPr>
-              <w:fldChar w:fldCharType="end"/>
-            </w:r>
-          </w:hyperlink>
-          <w:r>
-            <w:rPr>
-              <w:b/>
-              <w:bCs/>
-              <w:noProof/>
-            </w:rPr>
-            <w:fldChar w:fldCharType="end"/>
-          </w:r>
-        </w:p>
-      </w:sdtContent>
-    </w:sdt>
-    <w:p>
-      <w:pPr>
-        <w:rPr>
-          <w:noProof/>
-        </w:rPr>
-      </w:pPr>
-      <w:r>
-        <w:rPr>
-          <w:noProof/>
-        </w:rPr>
-        <w:br w:type="page"/>
-      </w:r>
-    </w:p>
-    <w:p>
-      <w:pPr>
-        <w:pStyle w:val="Heading1"/>
-        <w:numPr>
-          <w:ilvl w:val="0"/>
-          <w:numId w:val="13"/>
-        </w:numPr>
-        <w:jc w:val="both"/>
-        <w:rPr>
-          <w:color w:val="auto"/>
-        </w:rPr>
-      </w:pPr>
-      <w:bookmarkStart w:id="0" w:name="_Toc212216302"/>
-      <w:r>
-        <w:rPr>
-          <w:color w:val="auto"/>
-        </w:rPr>
-        <w:lastRenderedPageBreak/>
-        <w:t>Introduction</w:t>
-      </w:r>
-      <w:bookmarkEnd w:id="0"/>
-    </w:p>
-    <w:p/>
     <w:p>
       <w:pPr>
         <w:pStyle w:val="Heading1"/>
@@ -615,11 +339,11 @@
         </w:numPr>
         <w:jc w:val="both"/>
       </w:pPr>
-      <w:bookmarkStart w:id="1" w:name="_Toc212216309"/>
+      <w:bookmarkStart w:id="0" w:name="_Toc212216309"/>
       <w:r>
         <w:t>Work Date / Hours Log</w:t>
       </w:r>
-      <w:bookmarkEnd w:id="1"/>
+      <w:bookmarkEnd w:id="0"/>
     </w:p>
     <w:p>
       <w:pPr>
@@ -705,7 +429,10 @@
           </w:tcPr>
           <w:p>
             <w:r>
-              <w:t>4 hours</w:t>
+              <w:t>5</w:t>
+            </w:r>
+            <w:r>
+              <w:t xml:space="preserve"> hours</w:t>
             </w:r>
           </w:p>
         </w:tc>
@@ -716,6 +443,74 @@
           <w:p>
             <w:r>
               <w:t xml:space="preserve"> Research on all tools used to have clear understanding of planned approach and how to implement novel tool for project. </w:t>
+            </w:r>
+          </w:p>
+          <w:p/>
+          <w:p>
+            <w:r>
+              <w:t>Telegram installation on the emulator was verified using pm list packages | grep telegram, and the application directory was confirmed at /data/data/</w:t>
+            </w:r>
+            <w:proofErr w:type="spellStart"/>
+            <w:r>
+              <w:t>org.telegram.messenger</w:t>
+            </w:r>
+            <w:proofErr w:type="spellEnd"/>
+            <w:r>
+              <w:t xml:space="preserve">. The app’s data was then pulled to the emulator’s </w:t>
+            </w:r>
+            <w:proofErr w:type="spellStart"/>
+            <w:r>
+              <w:t>SDCard</w:t>
+            </w:r>
+            <w:proofErr w:type="spellEnd"/>
+            <w:r>
+              <w:t xml:space="preserve"> using </w:t>
+            </w:r>
+            <w:proofErr w:type="spellStart"/>
+            <w:r>
+              <w:t>adb</w:t>
+            </w:r>
+            <w:proofErr w:type="spellEnd"/>
+            <w:r>
+              <w:t xml:space="preserve"> pull and copied to the PC extraction folder. </w:t>
+            </w:r>
+            <w:proofErr w:type="spellStart"/>
+            <w:r>
+              <w:t>Andriller</w:t>
+            </w:r>
+            <w:proofErr w:type="spellEnd"/>
+            <w:r>
+              <w:t xml:space="preserve"> was used with </w:t>
+            </w:r>
+            <w:r>
+              <w:rPr>
+                <w:b/>
+                <w:bCs/>
+              </w:rPr>
+              <w:t>Extract Shared Storage</w:t>
+            </w:r>
+            <w:r>
+              <w:t xml:space="preserve"> and </w:t>
+            </w:r>
+            <w:r>
+              <w:rPr>
+                <w:b/>
+                <w:bCs/>
+              </w:rPr>
+              <w:t>App Data Decoders</w:t>
+            </w:r>
+            <w:r>
+              <w:t>, producing backup files (</w:t>
+            </w:r>
+            <w:proofErr w:type="spellStart"/>
+            <w:proofErr w:type="gramStart"/>
+            <w:r>
+              <w:t>backup.ab</w:t>
+            </w:r>
+            <w:proofErr w:type="spellEnd"/>
+            <w:proofErr w:type="gramEnd"/>
+            <w:r>
+              <w:t>), data/ and shared/ folders, and HTML/Excel reports.</w:t>
             </w:r>
           </w:p>
           <w:p/>
@@ -833,6 +628,43 @@
               <w:spacing w:after="160" w:line="278" w:lineRule="auto"/>
             </w:pPr>
             <w:r>
+              <w:t xml:space="preserve">Developed </w:t>
+            </w:r>
+            <w:r>
+              <w:t xml:space="preserve">custom Python script to automate extraction from </w:t>
+            </w:r>
+            <w:proofErr w:type="spellStart"/>
+            <w:r>
+              <w:t>Andriller</w:t>
+            </w:r>
+            <w:proofErr w:type="spellEnd"/>
+            <w:r>
+              <w:t xml:space="preserve"> outputs. The script scanned SQLite databases in the data/ folder, exported messages, chats, dialogs, and user data to CSV, extracted media from shared/, and identified potential keys in </w:t>
+            </w:r>
+            <w:proofErr w:type="spellStart"/>
+            <w:r>
+              <w:t>shared_prefs</w:t>
+            </w:r>
+            <w:proofErr w:type="spellEnd"/>
+            <w:r>
+              <w:t xml:space="preserve">/. Path handling issues were resolved using </w:t>
+            </w:r>
+            <w:proofErr w:type="spellStart"/>
+            <w:proofErr w:type="gramStart"/>
+            <w:r>
+              <w:t>pathlib.Path</w:t>
+            </w:r>
+            <w:proofErr w:type="spellEnd"/>
+            <w:proofErr w:type="gramEnd"/>
+            <w:r>
+              <w:t>.</w:t>
+            </w:r>
+          </w:p>
+          <w:p>
+            <w:pPr>
+              <w:spacing w:after="160" w:line="278" w:lineRule="auto"/>
+            </w:pPr>
+            <w:r>
               <w:rPr>
                 <w:b/>
                 <w:bCs/>
@@ -894,7 +726,6 @@
               <w:t xml:space="preserve"> Had multiple errors and spent a load of time debugging all errors and improving error handling.</w:t>
             </w:r>
           </w:p>
-          <w:p/>
         </w:tc>
       </w:tr>
       <w:tr>
@@ -904,6 +735,7 @@
           </w:tcPr>
           <w:p>
             <w:r>
+              <w:lastRenderedPageBreak/>
               <w:t>October 27</w:t>
             </w:r>
             <w:r>
@@ -942,6 +774,59 @@
             <w:proofErr w:type="spellEnd"/>
             <w:r>
               <w:t xml:space="preserve"> to gain extensive knowledge of the tool and how to use it and what can be potentially implemented in our novel tool. Looked into python as a language to use due to observation of other tools and libraries they used.</w:t>
+            </w:r>
+          </w:p>
+          <w:p/>
+          <w:p>
+            <w:r>
+              <w:t xml:space="preserve">Set up </w:t>
+            </w:r>
+            <w:r>
+              <w:t xml:space="preserve">ALEAPP </w:t>
+            </w:r>
+            <w:r>
+              <w:t xml:space="preserve">and </w:t>
+            </w:r>
+            <w:r>
+              <w:t>r</w:t>
+            </w:r>
+            <w:r>
+              <w:t>a</w:t>
+            </w:r>
+            <w:r>
+              <w:t xml:space="preserve">n on the </w:t>
+            </w:r>
+            <w:proofErr w:type="spellStart"/>
+            <w:r>
+              <w:t>Andriller</w:t>
+            </w:r>
+            <w:proofErr w:type="spellEnd"/>
+            <w:r>
+              <w:t xml:space="preserve"> extraction folder after installing dependencies. The tool generated HTML dashboards, CSV logs, and a _</w:t>
+            </w:r>
+            <w:proofErr w:type="spellStart"/>
+            <w:r>
+              <w:t>laval_artifacts</w:t>
+            </w:r>
+            <w:proofErr w:type="spellEnd"/>
+            <w:r>
+              <w:t xml:space="preserve"> folder summarizing app and device artifacts. This confirmed successful parsing of messages, chats, contacts, and media, while secret chats remained encrypted as expected. Local </w:t>
+            </w:r>
+            <w:proofErr w:type="spellStart"/>
+            <w:r>
+              <w:t>MTProto</w:t>
+            </w:r>
+            <w:proofErr w:type="spellEnd"/>
+            <w:r>
+              <w:t xml:space="preserve"> keys were successfully retrieved from </w:t>
+            </w:r>
+            <w:proofErr w:type="spellStart"/>
+            <w:r>
+              <w:t>shared_prefs</w:t>
+            </w:r>
+            <w:proofErr w:type="spellEnd"/>
+            <w:r>
+              <w:t xml:space="preserve"> and database files.</w:t>
             </w:r>
           </w:p>
           <w:p/>
@@ -1088,11 +973,7 @@
             </w:r>
             <w:proofErr w:type="spellEnd"/>
             <w:r>
-              <w:t xml:space="preserve"> -c id, but the emulator lacked a </w:t>
-            </w:r>
-            <w:r>
-              <w:lastRenderedPageBreak/>
-              <w:t xml:space="preserve">working </w:t>
+              <w:t xml:space="preserve"> -c id, but the emulator lacked a working </w:t>
             </w:r>
             <w:proofErr w:type="spellStart"/>
             <w:r>
@@ -1120,7 +1001,6 @@
           </w:tcPr>
           <w:p>
             <w:r>
-              <w:lastRenderedPageBreak/>
               <w:t>October 2</w:t>
             </w:r>
             <w:r>
@@ -1257,7 +1137,11 @@
           <w:tcPr>
             <w:tcW w:w="6237" w:type="dxa"/>
           </w:tcPr>
-          <w:p/>
+          <w:p>
+            <w:r>
+              <w:t xml:space="preserve">Research on novel tool implementation. </w:t>
+            </w:r>
+          </w:p>
         </w:tc>
       </w:tr>
       <w:tr>
@@ -1305,20 +1189,12 @@
               </w:rPr>
               <w:t>For the novel tool attempt</w:t>
             </w:r>
-            <w:proofErr w:type="gramStart"/>
-            <w:r>
-              <w:t>,</w:t>
-            </w:r>
-            <w:r>
-              <w:t xml:space="preserve"> </w:t>
-            </w:r>
             <w:r>
               <w:rPr>
                 <w:color w:val="FF0000"/>
               </w:rPr>
               <w:t>.</w:t>
             </w:r>
-            <w:proofErr w:type="gramEnd"/>
             <w:r>
               <w:t xml:space="preserve"> Implemented root status checking with multiple verification methods. Created JSON-formatted output for easy parsing and display. Added error handling for missing properties and connection issues.</w:t>
             </w:r>
@@ -1327,6 +1203,10 @@
         </w:tc>
       </w:tr>
       <w:tr>
+        <w:trPr>
+          <w:gridAfter w:val="1"/>
+          <w:wAfter w:w="6237" w:type="dxa"/>
+        </w:trPr>
         <w:tc>
           <w:tcPr>
             <w:tcW w:w="1696" w:type="dxa"/>
@@ -1359,14 +1239,12 @@
             </w:r>
           </w:p>
         </w:tc>
-        <w:tc>
-          <w:tcPr>
-            <w:tcW w:w="6237" w:type="dxa"/>
-          </w:tcPr>
-          <w:p/>
-        </w:tc>
       </w:tr>
       <w:tr>
+        <w:trPr>
+          <w:gridAfter w:val="1"/>
+          <w:wAfter w:w="6237" w:type="dxa"/>
+        </w:trPr>
         <w:tc>
           <w:tcPr>
             <w:tcW w:w="1696" w:type="dxa"/>
@@ -1398,12 +1276,6 @@
               <w:t xml:space="preserve">2 hours </w:t>
             </w:r>
           </w:p>
-        </w:tc>
-        <w:tc>
-          <w:tcPr>
-            <w:tcW w:w="6237" w:type="dxa"/>
-          </w:tcPr>
-          <w:p/>
         </w:tc>
       </w:tr>
       <w:tr>
@@ -1452,18 +1324,71 @@
               <w:t>For the novel tool attempt</w:t>
             </w:r>
             <w:r>
-              <w:t>,</w:t>
+              <w:t>, tried to fix Enabled Root functionality</w:t>
+            </w:r>
+            <w:r>
+              <w:t xml:space="preserve"> on the app</w:t>
+            </w:r>
+            <w:r>
+              <w:t>.</w:t>
+            </w:r>
+            <w:r>
+              <w:t xml:space="preserve"> </w:t>
+            </w:r>
+            <w:r>
+              <w:t xml:space="preserve">I first tried </w:t>
+            </w:r>
+            <w:proofErr w:type="spellStart"/>
+            <w:r>
+              <w:t>adb</w:t>
+            </w:r>
+            <w:proofErr w:type="spellEnd"/>
+            <w:r>
+              <w:t xml:space="preserve"> root and ADB server restarts, but the tool still showed no root. I then attempted UID verification using </w:t>
+            </w:r>
+            <w:proofErr w:type="spellStart"/>
+            <w:r>
+              <w:t>adb</w:t>
+            </w:r>
+            <w:proofErr w:type="spellEnd"/>
+            <w:r>
+              <w:t xml:space="preserve"> shell </w:t>
+            </w:r>
+            <w:proofErr w:type="spellStart"/>
+            <w:r>
+              <w:t>su</w:t>
+            </w:r>
+            <w:proofErr w:type="spellEnd"/>
+            <w:r>
+              <w:t xml:space="preserve"> -c "id", echo tests, and </w:t>
+            </w:r>
+            <w:proofErr w:type="spellStart"/>
+            <w:r>
+              <w:t>whoami</w:t>
+            </w:r>
+            <w:proofErr w:type="spellEnd"/>
+            <w:r>
+              <w:t xml:space="preserve"> checks, all of which failed to trigger detection in the tool. Each method confirmed root </w:t>
+            </w:r>
+            <w:r>
+              <w:lastRenderedPageBreak/>
+              <w:t>on the emulator, but the Python ADB module required further adjustments to recognize elevated permissions.</w:t>
             </w:r>
           </w:p>
         </w:tc>
       </w:tr>
       <w:tr>
+        <w:trPr>
+          <w:gridAfter w:val="1"/>
+          <w:wAfter w:w="6237" w:type="dxa"/>
+        </w:trPr>
         <w:tc>
           <w:tcPr>
             <w:tcW w:w="1696" w:type="dxa"/>
           </w:tcPr>
           <w:p>
             <w:r>
+              <w:lastRenderedPageBreak/>
               <w:t xml:space="preserve">November </w:t>
             </w:r>
             <w:r>
@@ -1490,12 +1415,6 @@
             </w:r>
           </w:p>
         </w:tc>
-        <w:tc>
-          <w:tcPr>
-            <w:tcW w:w="6237" w:type="dxa"/>
-          </w:tcPr>
-          <w:p/>
-        </w:tc>
       </w:tr>
       <w:tr>
         <w:tc>
@@ -1507,7 +1426,10 @@
               <w:t xml:space="preserve">November </w:t>
             </w:r>
             <w:r>
-              <w:t>10</w:t>
+              <w:t>1</w:t>
+            </w:r>
+            <w:r>
+              <w:t>1</w:t>
             </w:r>
             <w:r>
               <w:rPr>
@@ -1790,25 +1712,16 @@
     <w:p/>
     <w:p/>
     <w:p/>
-    <w:p/>
-    <w:p/>
     <w:p>
       <w:pPr>
-        <w:rPr>
-          <w:b/>
-          <w:bCs/>
-          <w:sz w:val="24"/>
-          <w:szCs w:val="24"/>
-        </w:rPr>
+        <w:pStyle w:val="Heading1"/>
+        <w:numPr>
+          <w:ilvl w:val="0"/>
+          <w:numId w:val="160"/>
+        </w:numPr>
+        <w:jc w:val="both"/>
       </w:pPr>
       <w:r>
-        <w:rPr>
-          <w:b/>
-          <w:bCs/>
-          <w:sz w:val="24"/>
-          <w:szCs w:val="24"/>
-        </w:rPr>
-        <w:lastRenderedPageBreak/>
         <w:t>Summary Of Work Done</w:t>
       </w:r>
     </w:p>
@@ -1971,75 +1884,1871 @@
     <w:p>
       <w:pPr>
         <w:rPr>
-          <w:b/>
-          <w:bCs/>
-          <w:sz w:val="24"/>
-          <w:szCs w:val="24"/>
+          <w:lang w:val="en-CA"/>
         </w:rPr>
       </w:pPr>
     </w:p>
     <w:p>
       <w:pPr>
         <w:rPr>
-          <w:sz w:val="24"/>
-          <w:szCs w:val="24"/>
+          <w:lang w:val="en-CA"/>
         </w:rPr>
       </w:pPr>
       <w:r>
         <w:rPr>
-          <w:sz w:val="24"/>
-          <w:szCs w:val="24"/>
+          <w:lang w:val="en-CA"/>
         </w:rPr>
-        <w:t xml:space="preserve">For extracting Telegram data, I focused exclusively on two tools: </w:t>
+        <w:t xml:space="preserve">For extracting Telegram data, I focused on </w:t>
       </w:r>
       <w:proofErr w:type="spellStart"/>
       <w:r>
         <w:rPr>
-          <w:sz w:val="24"/>
-          <w:szCs w:val="24"/>
+          <w:b/>
+          <w:bCs/>
+          <w:lang w:val="en-CA"/>
         </w:rPr>
         <w:t>Andriller</w:t>
       </w:r>
       <w:proofErr w:type="spellEnd"/>
       <w:r>
         <w:rPr>
-          <w:sz w:val="24"/>
-          <w:szCs w:val="24"/>
+          <w:lang w:val="en-CA"/>
         </w:rPr>
-        <w:t xml:space="preserve"> for direct data extraction and MVT for monitoring and forensic indicators. Using </w:t>
+        <w:t xml:space="preserve"> for direct data extraction and </w:t>
+      </w:r>
+      <w:r>
+        <w:rPr>
+          <w:b/>
+          <w:bCs/>
+          <w:lang w:val="en-CA"/>
+        </w:rPr>
+        <w:t>MVT</w:t>
+      </w:r>
+      <w:r>
+        <w:rPr>
+          <w:lang w:val="en-CA"/>
+        </w:rPr>
+        <w:t xml:space="preserve"> for monitoring and forensic indicators. Using </w:t>
       </w:r>
       <w:proofErr w:type="spellStart"/>
       <w:r>
         <w:rPr>
-          <w:sz w:val="24"/>
-          <w:szCs w:val="24"/>
+          <w:lang w:val="en-CA"/>
         </w:rPr>
         <w:t>Andriller</w:t>
       </w:r>
       <w:proofErr w:type="spellEnd"/>
       <w:r>
         <w:rPr>
-          <w:sz w:val="24"/>
-          <w:szCs w:val="24"/>
+          <w:lang w:val="en-CA"/>
         </w:rPr>
-        <w:t>, I attempted to pull the /data/data/</w:t>
+        <w:t>, I pulled the /data/data/</w:t>
       </w:r>
       <w:proofErr w:type="spellStart"/>
       <w:r>
         <w:rPr>
-          <w:sz w:val="24"/>
-          <w:szCs w:val="24"/>
+          <w:lang w:val="en-CA"/>
         </w:rPr>
         <w:t>org.telegram.messenger</w:t>
       </w:r>
       <w:proofErr w:type="spellEnd"/>
       <w:r>
         <w:rPr>
+          <w:lang w:val="en-CA"/>
+        </w:rPr>
+        <w:t xml:space="preserve"> folder from the emulator, successfully retrieving key components such as application databases, message logs, media files, and shared preferences. This provided the foundation for in-depth analysis, despite initial challenges with limited root access on the emulator.</w:t>
+      </w:r>
+    </w:p>
+    <w:p>
+      <w:pPr>
+        <w:rPr>
+          <w:lang w:val="en-CA"/>
+        </w:rPr>
+      </w:pPr>
+      <w:r>
+        <w:rPr>
+          <w:lang w:val="en-CA"/>
+        </w:rPr>
+        <w:t xml:space="preserve">To process the extracted data, I developed a </w:t>
+      </w:r>
+      <w:r>
+        <w:rPr>
+          <w:b/>
+          <w:bCs/>
+          <w:lang w:val="en-CA"/>
+        </w:rPr>
+        <w:t>Python script</w:t>
+      </w:r>
+      <w:r>
+        <w:rPr>
+          <w:lang w:val="en-CA"/>
+        </w:rPr>
+        <w:t xml:space="preserve"> that automated parsing of </w:t>
+      </w:r>
+      <w:proofErr w:type="spellStart"/>
+      <w:r>
+        <w:rPr>
+          <w:lang w:val="en-CA"/>
+        </w:rPr>
+        <w:t>Andriller</w:t>
+      </w:r>
+      <w:proofErr w:type="spellEnd"/>
+      <w:r>
+        <w:rPr>
+          <w:lang w:val="en-CA"/>
+        </w:rPr>
+        <w:t xml:space="preserve"> outputs. The script scanned the data/ folder for SQLite databases, exporting messages, chats, dialogs, and user information into structured CSV files. Media files from the shared/ folder were extracted into organized directories, and the script also analyzed </w:t>
+      </w:r>
+      <w:proofErr w:type="spellStart"/>
+      <w:r>
+        <w:rPr>
+          <w:lang w:val="en-CA"/>
+        </w:rPr>
+        <w:t>shared_prefs</w:t>
+      </w:r>
+      <w:proofErr w:type="spellEnd"/>
+      <w:r>
+        <w:rPr>
+          <w:lang w:val="en-CA"/>
+        </w:rPr>
+        <w:t xml:space="preserve"> to locate possible encryption or authentication keys. This automation streamlined the process, ensured consistency, and prepared the data for further analysis.</w:t>
+      </w:r>
+    </w:p>
+    <w:p>
+      <w:pPr>
+        <w:rPr>
+          <w:lang w:val="en-CA"/>
+        </w:rPr>
+      </w:pPr>
+      <w:r>
+        <w:rPr>
+          <w:lang w:val="en-CA"/>
+        </w:rPr>
+        <w:t xml:space="preserve">In parallel, </w:t>
+      </w:r>
+      <w:r>
+        <w:rPr>
+          <w:b/>
+          <w:bCs/>
+          <w:lang w:val="en-CA"/>
+        </w:rPr>
+        <w:t>MVT</w:t>
+      </w:r>
+      <w:r>
+        <w:rPr>
+          <w:lang w:val="en-CA"/>
+        </w:rPr>
+        <w:t xml:space="preserve"> was employed to monitor Telegram activity and verify forensic indicators. This included tracking login events, OTPs, and other application behaviors, complementing the extraction with real-time data about app activity. The combination of extraction via </w:t>
+      </w:r>
+      <w:proofErr w:type="spellStart"/>
+      <w:r>
+        <w:rPr>
+          <w:lang w:val="en-CA"/>
+        </w:rPr>
+        <w:t>Andriller</w:t>
+      </w:r>
+      <w:proofErr w:type="spellEnd"/>
+      <w:r>
+        <w:rPr>
+          <w:lang w:val="en-CA"/>
+        </w:rPr>
+        <w:t xml:space="preserve"> and monitoring via MVT allowed for a more complete forensic snapshot of Telegram usage on the emulator.</w:t>
+      </w:r>
+    </w:p>
+    <w:p>
+      <w:pPr>
+        <w:rPr>
+          <w:lang w:val="en-CA"/>
+        </w:rPr>
+      </w:pPr>
+      <w:r>
+        <w:rPr>
+          <w:lang w:val="en-CA"/>
+        </w:rPr>
+        <w:t xml:space="preserve">To extend the analysis further, the </w:t>
+      </w:r>
+      <w:r>
+        <w:rPr>
+          <w:b/>
+          <w:bCs/>
+          <w:lang w:val="en-CA"/>
+        </w:rPr>
+        <w:t>ALEAPP tool</w:t>
+      </w:r>
+      <w:r>
+        <w:rPr>
+          <w:lang w:val="en-CA"/>
+        </w:rPr>
+        <w:t xml:space="preserve"> was applied to the </w:t>
+      </w:r>
+      <w:proofErr w:type="spellStart"/>
+      <w:r>
+        <w:rPr>
+          <w:lang w:val="en-CA"/>
+        </w:rPr>
+        <w:t>Andriller</w:t>
+      </w:r>
+      <w:proofErr w:type="spellEnd"/>
+      <w:r>
+        <w:rPr>
+          <w:lang w:val="en-CA"/>
+        </w:rPr>
+        <w:t xml:space="preserve"> extraction outputs. ALEAPP parsed the extracted files and generated HTML dashboards, CSV logs, and a _</w:t>
+      </w:r>
+      <w:proofErr w:type="spellStart"/>
+      <w:r>
+        <w:rPr>
+          <w:lang w:val="en-CA"/>
+        </w:rPr>
+        <w:t>laval_artifacts</w:t>
+      </w:r>
+      <w:proofErr w:type="spellEnd"/>
+      <w:r>
+        <w:rPr>
+          <w:lang w:val="en-CA"/>
+        </w:rPr>
+        <w:t xml:space="preserve"> folder summarizing app and device artifacts. This enabled visualization of messages, media, user accounts, and events, providing a higher-level overview that supported both detailed examination and reporting. Secret chats remained encrypted as expected, but local </w:t>
+      </w:r>
+      <w:proofErr w:type="spellStart"/>
+      <w:r>
+        <w:rPr>
+          <w:lang w:val="en-CA"/>
+        </w:rPr>
+        <w:t>MTProto</w:t>
+      </w:r>
+      <w:proofErr w:type="spellEnd"/>
+      <w:r>
+        <w:rPr>
+          <w:lang w:val="en-CA"/>
+        </w:rPr>
+        <w:t xml:space="preserve"> keys were successfully retrieved from </w:t>
+      </w:r>
+      <w:proofErr w:type="spellStart"/>
+      <w:r>
+        <w:rPr>
+          <w:lang w:val="en-CA"/>
+        </w:rPr>
+        <w:t>shared_prefs</w:t>
+      </w:r>
+      <w:proofErr w:type="spellEnd"/>
+      <w:r>
+        <w:rPr>
+          <w:lang w:val="en-CA"/>
+        </w:rPr>
+        <w:t xml:space="preserve"> and database files, confirming the integrity of the extraction process.</w:t>
+      </w:r>
+    </w:p>
+    <w:p>
+      <w:pPr>
+        <w:rPr>
+          <w:lang w:val="en-CA"/>
+        </w:rPr>
+      </w:pPr>
+      <w:r>
+        <w:rPr>
+          <w:lang w:val="en-CA"/>
+        </w:rPr>
+        <w:t>Overall, this workflow</w:t>
+      </w:r>
+      <w:r>
+        <w:rPr>
+          <w:lang w:val="en-CA"/>
+        </w:rPr>
+        <w:t xml:space="preserve"> </w:t>
+      </w:r>
+      <w:r>
+        <w:rPr>
+          <w:lang w:val="en-CA"/>
+        </w:rPr>
+        <w:t xml:space="preserve">combining </w:t>
+      </w:r>
+      <w:proofErr w:type="spellStart"/>
+      <w:r>
+        <w:rPr>
+          <w:lang w:val="en-CA"/>
+        </w:rPr>
+        <w:t>Andriller</w:t>
+      </w:r>
+      <w:proofErr w:type="spellEnd"/>
+      <w:r>
+        <w:rPr>
+          <w:lang w:val="en-CA"/>
+        </w:rPr>
+        <w:t xml:space="preserve"> extraction, Python-based parsing, MVT monitoring, and ALEAPP analysis</w:t>
+      </w:r>
+      <w:r>
+        <w:rPr>
+          <w:lang w:val="en-CA"/>
+        </w:rPr>
+        <w:t xml:space="preserve"> </w:t>
+      </w:r>
+      <w:r>
+        <w:rPr>
+          <w:lang w:val="en-CA"/>
+        </w:rPr>
+        <w:t>produced a comprehensive dataset. Messages, chats, contacts, media, and potential encryption keys were all successfully captured, structured, and organized for reporting. This multi-tool approach not only validated the effectiveness of the extraction process but also provided a solid foundation for subsequent forensic reporting and deeper analysis of mobile application behavior</w:t>
+      </w:r>
+    </w:p>
+    <w:p>
+      <w:pPr>
+        <w:rPr>
+          <w:lang w:val="en-CA"/>
+        </w:rPr>
+      </w:pPr>
+    </w:p>
+    <w:p>
+      <w:pPr>
+        <w:pStyle w:val="Heading1"/>
+        <w:numPr>
+          <w:ilvl w:val="0"/>
+          <w:numId w:val="160"/>
+        </w:numPr>
+        <w:jc w:val="both"/>
+        <w:rPr>
           <w:sz w:val="24"/>
           <w:szCs w:val="24"/>
         </w:rPr>
-        <w:t xml:space="preserve"> folder to retrieve messages, media, and databases, but encountered persistent permission issues due to limited root access on the emulator.</w:t>
+      </w:pPr>
+      <w:r>
+        <w:t>Ai Use Section</w:t>
       </w:r>
+    </w:p>
+    <w:p>
+      <w:pPr>
+        <w:rPr>
+          <w:lang w:val="en-CA"/>
+        </w:rPr>
+      </w:pPr>
+    </w:p>
+    <w:tbl>
+      <w:tblPr>
+        <w:tblStyle w:val="TableGrid"/>
+        <w:tblW w:w="0" w:type="auto"/>
+        <w:tblLook w:val="04A0" w:firstRow="1" w:lastRow="0" w:firstColumn="1" w:lastColumn="0" w:noHBand="0" w:noVBand="1"/>
+      </w:tblPr>
+      <w:tblGrid>
+        <w:gridCol w:w="3116"/>
+        <w:gridCol w:w="3117"/>
+        <w:gridCol w:w="3117"/>
+      </w:tblGrid>
+      <w:tr>
+        <w:tc>
+          <w:tcPr>
+            <w:tcW w:w="3116" w:type="dxa"/>
+          </w:tcPr>
+          <w:p>
+            <w:r>
+              <w:t>AI Tool used</w:t>
+            </w:r>
+          </w:p>
+        </w:tc>
+        <w:tc>
+          <w:tcPr>
+            <w:tcW w:w="3117" w:type="dxa"/>
+          </w:tcPr>
+          <w:p>
+            <w:r>
+              <w:t xml:space="preserve">Version, </w:t>
+            </w:r>
+            <w:proofErr w:type="spellStart"/>
+            <w:r>
+              <w:t>AccountType</w:t>
+            </w:r>
+            <w:proofErr w:type="spellEnd"/>
+          </w:p>
+        </w:tc>
+        <w:tc>
+          <w:tcPr>
+            <w:tcW w:w="3117" w:type="dxa"/>
+          </w:tcPr>
+          <w:p>
+            <w:r>
+              <w:t>Specific Feature used for</w:t>
+            </w:r>
+          </w:p>
+        </w:tc>
+      </w:tr>
+      <w:tr>
+        <w:tc>
+          <w:tcPr>
+            <w:tcW w:w="3116" w:type="dxa"/>
+          </w:tcPr>
+          <w:p>
+            <w:r>
+              <w:t>GPT-5</w:t>
+            </w:r>
+          </w:p>
+        </w:tc>
+        <w:tc>
+          <w:tcPr>
+            <w:tcW w:w="3117" w:type="dxa"/>
+          </w:tcPr>
+          <w:p>
+            <w:r>
+              <w:t>5.1 codex mini</w:t>
+            </w:r>
+          </w:p>
+        </w:tc>
+        <w:tc>
+          <w:tcPr>
+            <w:tcW w:w="3117" w:type="dxa"/>
+          </w:tcPr>
+          <w:p>
+            <w:r>
+              <w:t xml:space="preserve">Used to understand the basic implementation steps needed to create a novel tool for forensics </w:t>
+            </w:r>
+          </w:p>
+        </w:tc>
+      </w:tr>
+      <w:tr>
+        <w:tc>
+          <w:tcPr>
+            <w:tcW w:w="3116" w:type="dxa"/>
+          </w:tcPr>
+          <w:p>
+            <w:r>
+              <w:t>Claude</w:t>
+            </w:r>
+          </w:p>
+        </w:tc>
+        <w:tc>
+          <w:tcPr>
+            <w:tcW w:w="3117" w:type="dxa"/>
+          </w:tcPr>
+          <w:p>
+            <w:r>
+              <w:t>Sonnet 4.5</w:t>
+            </w:r>
+            <w:r>
+              <w:t xml:space="preserve"> and </w:t>
+            </w:r>
+            <w:r>
+              <w:t>Haiku 4.5</w:t>
+            </w:r>
+          </w:p>
+        </w:tc>
+        <w:tc>
+          <w:tcPr>
+            <w:tcW w:w="3117" w:type="dxa"/>
+          </w:tcPr>
+          <w:p>
+            <w:r>
+              <w:t>Used to correct code errors and fix bugs and provide error handling.</w:t>
+            </w:r>
+          </w:p>
+        </w:tc>
+      </w:tr>
+    </w:tbl>
+    <w:p/>
+    <w:p>
+      <w:pPr>
+        <w:pStyle w:val="Heading1"/>
+        <w:numPr>
+          <w:ilvl w:val="0"/>
+          <w:numId w:val="160"/>
+        </w:numPr>
+        <w:jc w:val="both"/>
+      </w:pPr>
+      <w:r>
+        <w:t>Value Addition</w:t>
+      </w:r>
+    </w:p>
+    <w:p/>
+    <w:p>
+      <w:r>
+        <w:t xml:space="preserve">During the development of the Forensic Tool for 4440, I leveraged AI-assisted coding tools to address persistent root detection issues in the emulator. Although root privileges were present on the device, the tool was unable to detect them through the Python ADB module. I experimented with multiple approaches suggested by AI, including ADB root commands, UID verification via </w:t>
+      </w:r>
+      <w:proofErr w:type="spellStart"/>
+      <w:r>
+        <w:t>adb</w:t>
+      </w:r>
+      <w:proofErr w:type="spellEnd"/>
+      <w:r>
+        <w:t xml:space="preserve"> shell </w:t>
+      </w:r>
+      <w:proofErr w:type="spellStart"/>
+      <w:r>
+        <w:t>su</w:t>
+      </w:r>
+      <w:proofErr w:type="spellEnd"/>
+      <w:r>
+        <w:t xml:space="preserve"> -c "id", echo-based checks, and </w:t>
+      </w:r>
+      <w:proofErr w:type="spellStart"/>
+      <w:r>
+        <w:t>whoami</w:t>
+      </w:r>
+      <w:proofErr w:type="spellEnd"/>
+      <w:r>
+        <w:t xml:space="preserve"> validations, iteratively refining the code to update the GUI dynamically. AI also helped me design robust retry logic and diagnostic buttons, ensuring that root status could be refreshed or re-evaluated without restarting the entire application. Additionally, AI guidance contributed to modularizing the enable/disable root functionality, improving the user interface, and integrating error handling so the tool could reliably respond to different emulator configurations.</w:t>
+      </w:r>
+    </w:p>
+    <w:p/>
+    <w:p/>
+    <w:p>
+      <w:pPr>
+        <w:pStyle w:val="Heading1"/>
+        <w:numPr>
+          <w:ilvl w:val="0"/>
+          <w:numId w:val="160"/>
+        </w:numPr>
+        <w:jc w:val="both"/>
+      </w:pPr>
+      <w:r>
+        <w:t>APPENDIX</w:t>
+      </w:r>
+    </w:p>
+    <w:p/>
+    <w:p>
+      <w:pPr>
+        <w:rPr>
+          <w:lang w:val="en-CA"/>
+        </w:rPr>
+      </w:pPr>
+      <w:r>
+        <w:rPr>
+          <w:b/>
+          <w:bCs/>
+          <w:lang w:val="en-CA"/>
+        </w:rPr>
+        <w:t>Prompt:</w:t>
+      </w:r>
+      <w:r>
+        <w:rPr>
+          <w:lang w:val="en-CA"/>
+        </w:rPr>
+        <w:t xml:space="preserve"> "Write a Python function to check if root is enabled on an Android emulator using ADB and return True or False."</w:t>
+      </w:r>
+      <w:r>
+        <w:rPr>
+          <w:lang w:val="en-CA"/>
+        </w:rPr>
+        <w:br/>
+      </w:r>
+      <w:r>
+        <w:rPr>
+          <w:b/>
+          <w:bCs/>
+          <w:lang w:val="en-CA"/>
+        </w:rPr>
+        <w:t>AI Response / Suggestion:</w:t>
+      </w:r>
+    </w:p>
+    <w:p>
+      <w:pPr>
+        <w:rPr>
+          <w:lang w:val="en-CA"/>
+        </w:rPr>
+      </w:pPr>
+      <w:r>
+        <w:rPr>
+          <w:lang w:val="en-CA"/>
+        </w:rPr>
+        <w:t>import subprocess</w:t>
+      </w:r>
+    </w:p>
+    <w:p>
+      <w:pPr>
+        <w:rPr>
+          <w:lang w:val="en-CA"/>
+        </w:rPr>
+      </w:pPr>
+    </w:p>
+    <w:p>
+      <w:pPr>
+        <w:rPr>
+          <w:lang w:val="en-CA"/>
+        </w:rPr>
+      </w:pPr>
+      <w:r>
+        <w:rPr>
+          <w:lang w:val="en-CA"/>
+        </w:rPr>
+        <w:t xml:space="preserve">def </w:t>
+      </w:r>
+      <w:proofErr w:type="spellStart"/>
+      <w:r>
+        <w:rPr>
+          <w:lang w:val="en-CA"/>
+        </w:rPr>
+        <w:t>check_</w:t>
+      </w:r>
+      <w:proofErr w:type="gramStart"/>
+      <w:r>
+        <w:rPr>
+          <w:lang w:val="en-CA"/>
+        </w:rPr>
+        <w:t>root</w:t>
+      </w:r>
+      <w:proofErr w:type="spellEnd"/>
+      <w:r>
+        <w:rPr>
+          <w:lang w:val="en-CA"/>
+        </w:rPr>
+        <w:t>(</w:t>
+      </w:r>
+      <w:proofErr w:type="gramEnd"/>
+      <w:r>
+        <w:rPr>
+          <w:lang w:val="en-CA"/>
+        </w:rPr>
+        <w:t>):</w:t>
+      </w:r>
+    </w:p>
+    <w:p>
+      <w:pPr>
+        <w:rPr>
+          <w:lang w:val="en-CA"/>
+        </w:rPr>
+      </w:pPr>
+      <w:r>
+        <w:rPr>
+          <w:lang w:val="en-CA"/>
+        </w:rPr>
+        <w:t xml:space="preserve">    try:</w:t>
+      </w:r>
+    </w:p>
+    <w:p>
+      <w:pPr>
+        <w:rPr>
+          <w:lang w:val="en-CA"/>
+        </w:rPr>
+      </w:pPr>
+      <w:r>
+        <w:rPr>
+          <w:lang w:val="en-CA"/>
+        </w:rPr>
+        <w:t xml:space="preserve">        result = </w:t>
+      </w:r>
+      <w:proofErr w:type="spellStart"/>
+      <w:proofErr w:type="gramStart"/>
+      <w:r>
+        <w:rPr>
+          <w:lang w:val="en-CA"/>
+        </w:rPr>
+        <w:t>subprocess.run</w:t>
+      </w:r>
+      <w:proofErr w:type="spellEnd"/>
+      <w:r>
+        <w:rPr>
+          <w:lang w:val="en-CA"/>
+        </w:rPr>
+        <w:t>(</w:t>
+      </w:r>
+      <w:proofErr w:type="gramEnd"/>
+      <w:r>
+        <w:rPr>
+          <w:lang w:val="en-CA"/>
+        </w:rPr>
+        <w:t>['</w:t>
+      </w:r>
+      <w:proofErr w:type="spellStart"/>
+      <w:r>
+        <w:rPr>
+          <w:lang w:val="en-CA"/>
+        </w:rPr>
+        <w:t>adb</w:t>
+      </w:r>
+      <w:proofErr w:type="spellEnd"/>
+      <w:r>
+        <w:rPr>
+          <w:lang w:val="en-CA"/>
+        </w:rPr>
+        <w:t>', 'shell', '</w:t>
+      </w:r>
+      <w:proofErr w:type="spellStart"/>
+      <w:r>
+        <w:rPr>
+          <w:lang w:val="en-CA"/>
+        </w:rPr>
+        <w:t>su</w:t>
+      </w:r>
+      <w:proofErr w:type="spellEnd"/>
+      <w:r>
+        <w:rPr>
+          <w:lang w:val="en-CA"/>
+        </w:rPr>
+        <w:t>', '-c', 'id'],</w:t>
+      </w:r>
+    </w:p>
+    <w:p>
+      <w:pPr>
+        <w:rPr>
+          <w:lang w:val="en-CA"/>
+        </w:rPr>
+      </w:pPr>
+      <w:r>
+        <w:rPr>
+          <w:lang w:val="en-CA"/>
+        </w:rPr>
+        <w:t xml:space="preserve">                                </w:t>
+      </w:r>
+      <w:proofErr w:type="spellStart"/>
+      <w:r>
+        <w:rPr>
+          <w:lang w:val="en-CA"/>
+        </w:rPr>
+        <w:t>capture_output</w:t>
+      </w:r>
+      <w:proofErr w:type="spellEnd"/>
+      <w:r>
+        <w:rPr>
+          <w:lang w:val="en-CA"/>
+        </w:rPr>
+        <w:t>=True, text=True, timeout=5)</w:t>
+      </w:r>
+    </w:p>
+    <w:p>
+      <w:pPr>
+        <w:rPr>
+          <w:lang w:val="en-CA"/>
+        </w:rPr>
+      </w:pPr>
+      <w:r>
+        <w:rPr>
+          <w:lang w:val="en-CA"/>
+        </w:rPr>
+        <w:t xml:space="preserve">        if '</w:t>
+      </w:r>
+      <w:proofErr w:type="spellStart"/>
+      <w:r>
+        <w:rPr>
+          <w:lang w:val="en-CA"/>
+        </w:rPr>
+        <w:t>uid</w:t>
+      </w:r>
+      <w:proofErr w:type="spellEnd"/>
+      <w:r>
+        <w:rPr>
+          <w:lang w:val="en-CA"/>
+        </w:rPr>
+        <w:t xml:space="preserve">=0' in </w:t>
+      </w:r>
+      <w:proofErr w:type="spellStart"/>
+      <w:proofErr w:type="gramStart"/>
+      <w:r>
+        <w:rPr>
+          <w:lang w:val="en-CA"/>
+        </w:rPr>
+        <w:t>result.stdout</w:t>
+      </w:r>
+      <w:proofErr w:type="spellEnd"/>
+      <w:proofErr w:type="gramEnd"/>
+      <w:r>
+        <w:rPr>
+          <w:lang w:val="en-CA"/>
+        </w:rPr>
+        <w:t>:</w:t>
+      </w:r>
+    </w:p>
+    <w:p>
+      <w:pPr>
+        <w:rPr>
+          <w:lang w:val="en-CA"/>
+        </w:rPr>
+      </w:pPr>
+      <w:r>
+        <w:rPr>
+          <w:lang w:val="en-CA"/>
+        </w:rPr>
+        <w:t xml:space="preserve">            return True</w:t>
+      </w:r>
+    </w:p>
+    <w:p>
+      <w:pPr>
+        <w:rPr>
+          <w:lang w:val="en-CA"/>
+        </w:rPr>
+      </w:pPr>
+      <w:r>
+        <w:rPr>
+          <w:lang w:val="en-CA"/>
+        </w:rPr>
+        <w:t xml:space="preserve">        return False</w:t>
+      </w:r>
+    </w:p>
+    <w:p>
+      <w:pPr>
+        <w:rPr>
+          <w:lang w:val="en-CA"/>
+        </w:rPr>
+      </w:pPr>
+      <w:r>
+        <w:rPr>
+          <w:lang w:val="en-CA"/>
+        </w:rPr>
+        <w:t xml:space="preserve">    except Exception:</w:t>
+      </w:r>
+    </w:p>
+    <w:p>
+      <w:pPr>
+        <w:rPr>
+          <w:lang w:val="en-CA"/>
+        </w:rPr>
+      </w:pPr>
+      <w:r>
+        <w:rPr>
+          <w:lang w:val="en-CA"/>
+        </w:rPr>
+        <w:t xml:space="preserve">        return False</w:t>
+      </w:r>
+    </w:p>
+    <w:p>
+      <w:r>
+        <w:rPr>
+          <w:b/>
+          <w:bCs/>
+          <w:lang w:val="en-CA"/>
+        </w:rPr>
+        <w:lastRenderedPageBreak/>
+        <w:t>I tested it, but it returned inconsistent results on some emulator images.</w:t>
+      </w:r>
+      <w:r>
+        <w:rPr>
+          <w:lang w:val="en-CA"/>
+        </w:rPr>
+        <w:br/>
+      </w:r>
+      <w:r>
+        <w:rPr>
+          <w:lang w:val="en-CA"/>
+        </w:rPr>
+        <w:br/>
+      </w:r>
+      <w:r>
+        <w:rPr>
+          <w:lang w:val="en-CA"/>
+        </w:rPr>
+        <w:br/>
+      </w:r>
+      <w:r>
+        <w:rPr>
+          <w:b/>
+          <w:bCs/>
+        </w:rPr>
+        <w:t>Prompt:</w:t>
+      </w:r>
+      <w:r>
+        <w:t xml:space="preserve"> "Update a </w:t>
+      </w:r>
+      <w:proofErr w:type="spellStart"/>
+      <w:r>
+        <w:t>Tkinter</w:t>
+      </w:r>
+      <w:proofErr w:type="spellEnd"/>
+      <w:r>
+        <w:t xml:space="preserve"> label in real-time with root status after checking with ADB."</w:t>
+      </w:r>
+      <w:r>
+        <w:br/>
+      </w:r>
+      <w:r>
+        <w:rPr>
+          <w:b/>
+          <w:bCs/>
+        </w:rPr>
+        <w:t>AI Response / Suggestion:</w:t>
+      </w:r>
+    </w:p>
+    <w:p>
+      <w:pPr>
+        <w:rPr>
+          <w:lang w:val="en-CA"/>
+        </w:rPr>
+      </w:pPr>
+      <w:proofErr w:type="spellStart"/>
+      <w:proofErr w:type="gramStart"/>
+      <w:r>
+        <w:rPr>
+          <w:lang w:val="en-CA"/>
+        </w:rPr>
+        <w:t>self.root</w:t>
+      </w:r>
+      <w:proofErr w:type="gramEnd"/>
+      <w:r>
+        <w:rPr>
+          <w:lang w:val="en-CA"/>
+        </w:rPr>
+        <w:t>_status_var</w:t>
+      </w:r>
+      <w:proofErr w:type="spellEnd"/>
+      <w:r>
+        <w:rPr>
+          <w:lang w:val="en-CA"/>
+        </w:rPr>
+        <w:t xml:space="preserve"> = </w:t>
+      </w:r>
+      <w:proofErr w:type="spellStart"/>
+      <w:r>
+        <w:rPr>
+          <w:lang w:val="en-CA"/>
+        </w:rPr>
+        <w:t>tk.StringVar</w:t>
+      </w:r>
+      <w:proofErr w:type="spellEnd"/>
+      <w:r>
+        <w:rPr>
+          <w:lang w:val="en-CA"/>
+        </w:rPr>
+        <w:t>()</w:t>
+      </w:r>
+    </w:p>
+    <w:p>
+      <w:pPr>
+        <w:rPr>
+          <w:lang w:val="en-CA"/>
+        </w:rPr>
+      </w:pPr>
+      <w:proofErr w:type="spellStart"/>
+      <w:proofErr w:type="gramStart"/>
+      <w:r>
+        <w:rPr>
+          <w:lang w:val="en-CA"/>
+        </w:rPr>
+        <w:t>self.root</w:t>
+      </w:r>
+      <w:proofErr w:type="gramEnd"/>
+      <w:r>
+        <w:rPr>
+          <w:lang w:val="en-CA"/>
+        </w:rPr>
+        <w:t>_status_label</w:t>
+      </w:r>
+      <w:proofErr w:type="spellEnd"/>
+      <w:r>
+        <w:rPr>
+          <w:lang w:val="en-CA"/>
+        </w:rPr>
+        <w:t xml:space="preserve"> = </w:t>
+      </w:r>
+      <w:proofErr w:type="spellStart"/>
+      <w:r>
+        <w:rPr>
+          <w:lang w:val="en-CA"/>
+        </w:rPr>
+        <w:t>tk.Label</w:t>
+      </w:r>
+      <w:proofErr w:type="spellEnd"/>
+      <w:r>
+        <w:rPr>
+          <w:lang w:val="en-CA"/>
+        </w:rPr>
+        <w:t>(</w:t>
+      </w:r>
+      <w:proofErr w:type="spellStart"/>
+      <w:r>
+        <w:rPr>
+          <w:lang w:val="en-CA"/>
+        </w:rPr>
+        <w:t>root_frame</w:t>
+      </w:r>
+      <w:proofErr w:type="spellEnd"/>
+      <w:r>
+        <w:rPr>
+          <w:lang w:val="en-CA"/>
+        </w:rPr>
+        <w:t xml:space="preserve">, </w:t>
+      </w:r>
+      <w:proofErr w:type="spellStart"/>
+      <w:r>
+        <w:rPr>
+          <w:lang w:val="en-CA"/>
+        </w:rPr>
+        <w:t>textvariable</w:t>
+      </w:r>
+      <w:proofErr w:type="spellEnd"/>
+      <w:r>
+        <w:rPr>
+          <w:lang w:val="en-CA"/>
+        </w:rPr>
+        <w:t>=</w:t>
+      </w:r>
+      <w:proofErr w:type="spellStart"/>
+      <w:r>
+        <w:rPr>
+          <w:lang w:val="en-CA"/>
+        </w:rPr>
+        <w:t>self.root_status_var</w:t>
+      </w:r>
+      <w:proofErr w:type="spellEnd"/>
+      <w:r>
+        <w:rPr>
+          <w:lang w:val="en-CA"/>
+        </w:rPr>
+        <w:t>)</w:t>
+      </w:r>
+    </w:p>
+    <w:p>
+      <w:pPr>
+        <w:rPr>
+          <w:lang w:val="en-CA"/>
+        </w:rPr>
+      </w:pPr>
+      <w:proofErr w:type="spellStart"/>
+      <w:proofErr w:type="gramStart"/>
+      <w:r>
+        <w:rPr>
+          <w:lang w:val="en-CA"/>
+        </w:rPr>
+        <w:t>self.root_status_var.set</w:t>
+      </w:r>
+      <w:proofErr w:type="spellEnd"/>
+      <w:r>
+        <w:rPr>
+          <w:lang w:val="en-CA"/>
+        </w:rPr>
+        <w:t>(</w:t>
+      </w:r>
+      <w:proofErr w:type="gramEnd"/>
+      <w:r>
+        <w:rPr>
+          <w:lang w:val="en-CA"/>
+        </w:rPr>
+        <w:t>"Root Status: Checking...")</w:t>
+      </w:r>
+    </w:p>
+    <w:p>
+      <w:pPr>
+        <w:rPr>
+          <w:lang w:val="en-CA"/>
+        </w:rPr>
+      </w:pPr>
+    </w:p>
+    <w:p>
+      <w:pPr>
+        <w:rPr>
+          <w:lang w:val="en-CA"/>
+        </w:rPr>
+      </w:pPr>
+      <w:r>
+        <w:rPr>
+          <w:lang w:val="en-CA"/>
+        </w:rPr>
+        <w:t xml:space="preserve">def </w:t>
+      </w:r>
+      <w:proofErr w:type="spellStart"/>
+      <w:r>
+        <w:rPr>
+          <w:lang w:val="en-CA"/>
+        </w:rPr>
+        <w:t>refresh_root_</w:t>
+      </w:r>
+      <w:proofErr w:type="gramStart"/>
+      <w:r>
+        <w:rPr>
+          <w:lang w:val="en-CA"/>
+        </w:rPr>
+        <w:t>label</w:t>
+      </w:r>
+      <w:proofErr w:type="spellEnd"/>
+      <w:r>
+        <w:rPr>
+          <w:lang w:val="en-CA"/>
+        </w:rPr>
+        <w:t>(</w:t>
+      </w:r>
+      <w:proofErr w:type="gramEnd"/>
+      <w:r>
+        <w:rPr>
+          <w:lang w:val="en-CA"/>
+        </w:rPr>
+        <w:t>):</w:t>
+      </w:r>
+    </w:p>
+    <w:p>
+      <w:pPr>
+        <w:rPr>
+          <w:lang w:val="en-CA"/>
+        </w:rPr>
+      </w:pPr>
+      <w:r>
+        <w:rPr>
+          <w:lang w:val="en-CA"/>
+        </w:rPr>
+        <w:t xml:space="preserve">    </w:t>
+      </w:r>
+      <w:proofErr w:type="spellStart"/>
+      <w:r>
+        <w:rPr>
+          <w:lang w:val="en-CA"/>
+        </w:rPr>
+        <w:t>is_rooted</w:t>
+      </w:r>
+      <w:proofErr w:type="spellEnd"/>
+      <w:r>
+        <w:rPr>
+          <w:lang w:val="en-CA"/>
+        </w:rPr>
+        <w:t xml:space="preserve"> = </w:t>
+      </w:r>
+      <w:proofErr w:type="spellStart"/>
+      <w:r>
+        <w:rPr>
+          <w:lang w:val="en-CA"/>
+        </w:rPr>
+        <w:t>check_</w:t>
+      </w:r>
+      <w:proofErr w:type="gramStart"/>
+      <w:r>
+        <w:rPr>
+          <w:lang w:val="en-CA"/>
+        </w:rPr>
+        <w:t>root</w:t>
+      </w:r>
+      <w:proofErr w:type="spellEnd"/>
+      <w:r>
+        <w:rPr>
+          <w:lang w:val="en-CA"/>
+        </w:rPr>
+        <w:t>(</w:t>
+      </w:r>
+      <w:proofErr w:type="gramEnd"/>
+      <w:r>
+        <w:rPr>
+          <w:lang w:val="en-CA"/>
+        </w:rPr>
+        <w:t>)</w:t>
+      </w:r>
+    </w:p>
+    <w:p>
+      <w:pPr>
+        <w:rPr>
+          <w:lang w:val="en-CA"/>
+        </w:rPr>
+      </w:pPr>
+      <w:r>
+        <w:rPr>
+          <w:lang w:val="en-CA"/>
+        </w:rPr>
+        <w:t xml:space="preserve">    </w:t>
+      </w:r>
+      <w:proofErr w:type="spellStart"/>
+      <w:proofErr w:type="gramStart"/>
+      <w:r>
+        <w:rPr>
+          <w:lang w:val="en-CA"/>
+        </w:rPr>
+        <w:t>self.root_status_var.set</w:t>
+      </w:r>
+      <w:proofErr w:type="spellEnd"/>
+      <w:r>
+        <w:rPr>
+          <w:lang w:val="en-CA"/>
+        </w:rPr>
+        <w:t>(</w:t>
+      </w:r>
+      <w:proofErr w:type="gramEnd"/>
+      <w:r>
+        <w:rPr>
+          <w:lang w:val="en-CA"/>
+        </w:rPr>
+        <w:t xml:space="preserve">"Root Status: Enabled" if </w:t>
+      </w:r>
+      <w:proofErr w:type="spellStart"/>
+      <w:r>
+        <w:rPr>
+          <w:lang w:val="en-CA"/>
+        </w:rPr>
+        <w:t>is_rooted</w:t>
+      </w:r>
+      <w:proofErr w:type="spellEnd"/>
+      <w:r>
+        <w:rPr>
+          <w:lang w:val="en-CA"/>
+        </w:rPr>
+        <w:t xml:space="preserve"> else "Root Status: Disabled")</w:t>
+      </w:r>
+    </w:p>
+    <w:p>
+      <w:pPr>
+        <w:rPr>
+          <w:lang w:val="en-CA"/>
+        </w:rPr>
+      </w:pPr>
+    </w:p>
+    <w:p>
+      <w:pPr>
+        <w:rPr>
+          <w:b/>
+          <w:bCs/>
+          <w:lang w:val="en-CA"/>
+        </w:rPr>
+      </w:pPr>
+      <w:r>
+        <w:rPr>
+          <w:b/>
+          <w:bCs/>
+          <w:lang w:val="en-CA"/>
+        </w:rPr>
+        <w:t>I integrated this with threading to prevent GUI freezing during ADB calls.</w:t>
+      </w:r>
+    </w:p>
+    <w:p>
+      <w:pPr>
+        <w:rPr>
+          <w:b/>
+          <w:bCs/>
+          <w:lang w:val="en-CA"/>
+        </w:rPr>
+      </w:pPr>
+    </w:p>
+    <w:p>
+      <w:pPr>
+        <w:rPr>
+          <w:b/>
+          <w:bCs/>
+        </w:rPr>
+      </w:pPr>
+      <w:r>
+        <w:rPr>
+          <w:b/>
+          <w:bCs/>
+        </w:rPr>
+        <w:t>My emulator has root enabled, but my Python tool doesn’t detect it. How can I check root properly using ADB?”</w:t>
+      </w:r>
+    </w:p>
+    <w:p>
+      <w:pPr>
+        <w:rPr>
+          <w:b/>
+          <w:bCs/>
+        </w:rPr>
+      </w:pPr>
+    </w:p>
+    <w:p>
+      <w:pPr>
+        <w:rPr>
+          <w:b/>
+          <w:bCs/>
+          <w:lang w:val="en-CA"/>
+        </w:rPr>
+      </w:pPr>
+      <w:r>
+        <w:rPr>
+          <w:b/>
+          <w:bCs/>
+          <w:lang w:val="en-CA"/>
+        </w:rPr>
+        <w:t xml:space="preserve">You can combine several ADB-based checks because sometimes </w:t>
+      </w:r>
+      <w:proofErr w:type="spellStart"/>
+      <w:r>
+        <w:rPr>
+          <w:b/>
+          <w:bCs/>
+          <w:lang w:val="en-CA"/>
+        </w:rPr>
+        <w:t>adb</w:t>
+      </w:r>
+      <w:proofErr w:type="spellEnd"/>
+      <w:r>
+        <w:rPr>
+          <w:b/>
+          <w:bCs/>
+          <w:lang w:val="en-CA"/>
+        </w:rPr>
+        <w:t xml:space="preserve"> shell </w:t>
+      </w:r>
+      <w:proofErr w:type="spellStart"/>
+      <w:r>
+        <w:rPr>
+          <w:b/>
+          <w:bCs/>
+          <w:lang w:val="en-CA"/>
+        </w:rPr>
+        <w:t>su</w:t>
+      </w:r>
+      <w:proofErr w:type="spellEnd"/>
+      <w:r>
+        <w:rPr>
+          <w:b/>
+          <w:bCs/>
+          <w:lang w:val="en-CA"/>
+        </w:rPr>
+        <w:t xml:space="preserve"> -c "id" fails on certain images. Here’s an approach using multiple commands:</w:t>
+      </w:r>
+    </w:p>
+    <w:p>
+      <w:pPr>
+        <w:rPr>
+          <w:b/>
+          <w:bCs/>
+          <w:lang w:val="en-CA"/>
+        </w:rPr>
+      </w:pPr>
+      <w:r>
+        <w:rPr>
+          <w:b/>
+          <w:bCs/>
+          <w:lang w:val="en-CA"/>
+        </w:rPr>
+        <w:t xml:space="preserve">def </w:t>
+      </w:r>
+      <w:proofErr w:type="spellStart"/>
+      <w:r>
+        <w:rPr>
+          <w:b/>
+          <w:bCs/>
+          <w:lang w:val="en-CA"/>
+        </w:rPr>
+        <w:t>check_</w:t>
+      </w:r>
+      <w:proofErr w:type="gramStart"/>
+      <w:r>
+        <w:rPr>
+          <w:b/>
+          <w:bCs/>
+          <w:lang w:val="en-CA"/>
+        </w:rPr>
+        <w:t>root</w:t>
+      </w:r>
+      <w:proofErr w:type="spellEnd"/>
+      <w:r>
+        <w:rPr>
+          <w:b/>
+          <w:bCs/>
+          <w:lang w:val="en-CA"/>
+        </w:rPr>
+        <w:t>(</w:t>
+      </w:r>
+      <w:proofErr w:type="gramEnd"/>
+      <w:r>
+        <w:rPr>
+          <w:b/>
+          <w:bCs/>
+          <w:lang w:val="en-CA"/>
+        </w:rPr>
+        <w:t>):</w:t>
+      </w:r>
+    </w:p>
+    <w:p>
+      <w:pPr>
+        <w:rPr>
+          <w:b/>
+          <w:bCs/>
+          <w:lang w:val="en-CA"/>
+        </w:rPr>
+      </w:pPr>
+      <w:r>
+        <w:rPr>
+          <w:b/>
+          <w:bCs/>
+          <w:lang w:val="en-CA"/>
+        </w:rPr>
+        <w:t xml:space="preserve">    commands = [</w:t>
+      </w:r>
+    </w:p>
+    <w:p>
+      <w:pPr>
+        <w:rPr>
+          <w:b/>
+          <w:bCs/>
+          <w:lang w:val="en-CA"/>
+        </w:rPr>
+      </w:pPr>
+      <w:r>
+        <w:rPr>
+          <w:b/>
+          <w:bCs/>
+          <w:lang w:val="en-CA"/>
+        </w:rPr>
+        <w:t xml:space="preserve">        "</w:t>
+      </w:r>
+      <w:proofErr w:type="spellStart"/>
+      <w:proofErr w:type="gramStart"/>
+      <w:r>
+        <w:rPr>
+          <w:b/>
+          <w:bCs/>
+          <w:lang w:val="en-CA"/>
+        </w:rPr>
+        <w:t>adb</w:t>
+      </w:r>
+      <w:proofErr w:type="spellEnd"/>
+      <w:proofErr w:type="gramEnd"/>
+      <w:r>
+        <w:rPr>
+          <w:b/>
+          <w:bCs/>
+          <w:lang w:val="en-CA"/>
+        </w:rPr>
+        <w:t xml:space="preserve"> shell </w:t>
+      </w:r>
+      <w:proofErr w:type="spellStart"/>
+      <w:r>
+        <w:rPr>
+          <w:b/>
+          <w:bCs/>
+          <w:lang w:val="en-CA"/>
+        </w:rPr>
+        <w:t>su</w:t>
+      </w:r>
+      <w:proofErr w:type="spellEnd"/>
+      <w:r>
+        <w:rPr>
+          <w:b/>
+          <w:bCs/>
+          <w:lang w:val="en-CA"/>
+        </w:rPr>
+        <w:t xml:space="preserve"> -c 'id'",</w:t>
+      </w:r>
+    </w:p>
+    <w:p>
+      <w:pPr>
+        <w:rPr>
+          <w:b/>
+          <w:bCs/>
+          <w:lang w:val="en-CA"/>
+        </w:rPr>
+      </w:pPr>
+      <w:r>
+        <w:rPr>
+          <w:b/>
+          <w:bCs/>
+          <w:lang w:val="en-CA"/>
+        </w:rPr>
+        <w:t xml:space="preserve">        "</w:t>
+      </w:r>
+      <w:proofErr w:type="spellStart"/>
+      <w:proofErr w:type="gramStart"/>
+      <w:r>
+        <w:rPr>
+          <w:b/>
+          <w:bCs/>
+          <w:lang w:val="en-CA"/>
+        </w:rPr>
+        <w:t>adb</w:t>
+      </w:r>
+      <w:proofErr w:type="spellEnd"/>
+      <w:proofErr w:type="gramEnd"/>
+      <w:r>
+        <w:rPr>
+          <w:b/>
+          <w:bCs/>
+          <w:lang w:val="en-CA"/>
+        </w:rPr>
+        <w:t xml:space="preserve"> shell </w:t>
+      </w:r>
+      <w:proofErr w:type="spellStart"/>
+      <w:r>
+        <w:rPr>
+          <w:b/>
+          <w:bCs/>
+          <w:lang w:val="en-CA"/>
+        </w:rPr>
+        <w:t>whoami</w:t>
+      </w:r>
+      <w:proofErr w:type="spellEnd"/>
+      <w:r>
+        <w:rPr>
+          <w:b/>
+          <w:bCs/>
+          <w:lang w:val="en-CA"/>
+        </w:rPr>
+        <w:t>",</w:t>
+      </w:r>
+    </w:p>
+    <w:p>
+      <w:pPr>
+        <w:rPr>
+          <w:b/>
+          <w:bCs/>
+          <w:lang w:val="en-CA"/>
+        </w:rPr>
+      </w:pPr>
+      <w:r>
+        <w:rPr>
+          <w:b/>
+          <w:bCs/>
+          <w:lang w:val="en-CA"/>
+        </w:rPr>
+        <w:t xml:space="preserve">        "</w:t>
+      </w:r>
+      <w:proofErr w:type="spellStart"/>
+      <w:proofErr w:type="gramStart"/>
+      <w:r>
+        <w:rPr>
+          <w:b/>
+          <w:bCs/>
+          <w:lang w:val="en-CA"/>
+        </w:rPr>
+        <w:t>adb</w:t>
+      </w:r>
+      <w:proofErr w:type="spellEnd"/>
+      <w:proofErr w:type="gramEnd"/>
+      <w:r>
+        <w:rPr>
+          <w:b/>
+          <w:bCs/>
+          <w:lang w:val="en-CA"/>
+        </w:rPr>
+        <w:t xml:space="preserve"> shell 'echo ROOT_CHECK'",</w:t>
+      </w:r>
+    </w:p>
+    <w:p>
+      <w:pPr>
+        <w:rPr>
+          <w:b/>
+          <w:bCs/>
+          <w:lang w:val="en-CA"/>
+        </w:rPr>
+      </w:pPr>
+      <w:r>
+        <w:rPr>
+          <w:b/>
+          <w:bCs/>
+          <w:lang w:val="en-CA"/>
+        </w:rPr>
+        <w:t xml:space="preserve">        "</w:t>
+      </w:r>
+      <w:proofErr w:type="spellStart"/>
+      <w:r>
+        <w:rPr>
+          <w:b/>
+          <w:bCs/>
+          <w:lang w:val="en-CA"/>
+        </w:rPr>
+        <w:t>adb</w:t>
+      </w:r>
+      <w:proofErr w:type="spellEnd"/>
+      <w:r>
+        <w:rPr>
+          <w:b/>
+          <w:bCs/>
+          <w:lang w:val="en-CA"/>
+        </w:rPr>
+        <w:t xml:space="preserve"> shell </w:t>
+      </w:r>
+      <w:proofErr w:type="spellStart"/>
+      <w:r>
+        <w:rPr>
+          <w:b/>
+          <w:bCs/>
+          <w:lang w:val="en-CA"/>
+        </w:rPr>
+        <w:t>getprop</w:t>
+      </w:r>
+      <w:proofErr w:type="spellEnd"/>
+      <w:r>
+        <w:rPr>
+          <w:b/>
+          <w:bCs/>
+          <w:lang w:val="en-CA"/>
+        </w:rPr>
+        <w:t xml:space="preserve"> </w:t>
+      </w:r>
+      <w:proofErr w:type="spellStart"/>
+      <w:proofErr w:type="gramStart"/>
+      <w:r>
+        <w:rPr>
+          <w:b/>
+          <w:bCs/>
+          <w:lang w:val="en-CA"/>
+        </w:rPr>
+        <w:t>ro.secure</w:t>
+      </w:r>
+      <w:proofErr w:type="spellEnd"/>
+      <w:proofErr w:type="gramEnd"/>
+      <w:r>
+        <w:rPr>
+          <w:b/>
+          <w:bCs/>
+          <w:lang w:val="en-CA"/>
+        </w:rPr>
+        <w:t>"</w:t>
+      </w:r>
+    </w:p>
+    <w:p>
+      <w:pPr>
+        <w:rPr>
+          <w:b/>
+          <w:bCs/>
+          <w:lang w:val="en-CA"/>
+        </w:rPr>
+      </w:pPr>
+      <w:r>
+        <w:rPr>
+          <w:b/>
+          <w:bCs/>
+          <w:lang w:val="en-CA"/>
+        </w:rPr>
+        <w:t xml:space="preserve">    ]</w:t>
+      </w:r>
+    </w:p>
+    <w:p>
+      <w:pPr>
+        <w:rPr>
+          <w:b/>
+          <w:bCs/>
+          <w:lang w:val="en-CA"/>
+        </w:rPr>
+      </w:pPr>
+      <w:r>
+        <w:rPr>
+          <w:b/>
+          <w:bCs/>
+          <w:lang w:val="en-CA"/>
+        </w:rPr>
+        <w:t xml:space="preserve">    for </w:t>
+      </w:r>
+      <w:proofErr w:type="spellStart"/>
+      <w:r>
+        <w:rPr>
+          <w:b/>
+          <w:bCs/>
+          <w:lang w:val="en-CA"/>
+        </w:rPr>
+        <w:t>cmd</w:t>
+      </w:r>
+      <w:proofErr w:type="spellEnd"/>
+      <w:r>
+        <w:rPr>
+          <w:b/>
+          <w:bCs/>
+          <w:lang w:val="en-CA"/>
+        </w:rPr>
+        <w:t xml:space="preserve"> in commands:</w:t>
+      </w:r>
+    </w:p>
+    <w:p>
+      <w:pPr>
+        <w:rPr>
+          <w:b/>
+          <w:bCs/>
+          <w:lang w:val="en-CA"/>
+        </w:rPr>
+      </w:pPr>
+      <w:r>
+        <w:rPr>
+          <w:b/>
+          <w:bCs/>
+          <w:lang w:val="en-CA"/>
+        </w:rPr>
+        <w:t xml:space="preserve">        try:</w:t>
+      </w:r>
+    </w:p>
+    <w:p>
+      <w:pPr>
+        <w:rPr>
+          <w:b/>
+          <w:bCs/>
+          <w:lang w:val="en-CA"/>
+        </w:rPr>
+      </w:pPr>
+      <w:r>
+        <w:rPr>
+          <w:b/>
+          <w:bCs/>
+          <w:lang w:val="en-CA"/>
+        </w:rPr>
+        <w:t xml:space="preserve">            result = </w:t>
+      </w:r>
+      <w:proofErr w:type="spellStart"/>
+      <w:r>
+        <w:rPr>
+          <w:b/>
+          <w:bCs/>
+          <w:lang w:val="en-CA"/>
+        </w:rPr>
+        <w:t>subprocess.run</w:t>
+      </w:r>
+      <w:proofErr w:type="spellEnd"/>
+      <w:r>
+        <w:rPr>
+          <w:b/>
+          <w:bCs/>
+          <w:lang w:val="en-CA"/>
+        </w:rPr>
+        <w:t>(</w:t>
+      </w:r>
+      <w:proofErr w:type="spellStart"/>
+      <w:proofErr w:type="gramStart"/>
+      <w:r>
+        <w:rPr>
+          <w:b/>
+          <w:bCs/>
+          <w:lang w:val="en-CA"/>
+        </w:rPr>
+        <w:t>cmd.split</w:t>
+      </w:r>
+      <w:proofErr w:type="spellEnd"/>
+      <w:proofErr w:type="gramEnd"/>
+      <w:r>
+        <w:rPr>
+          <w:b/>
+          <w:bCs/>
+          <w:lang w:val="en-CA"/>
+        </w:rPr>
+        <w:t xml:space="preserve">(), </w:t>
+      </w:r>
+      <w:proofErr w:type="spellStart"/>
+      <w:r>
+        <w:rPr>
+          <w:b/>
+          <w:bCs/>
+          <w:lang w:val="en-CA"/>
+        </w:rPr>
+        <w:t>capture_output</w:t>
+      </w:r>
+      <w:proofErr w:type="spellEnd"/>
+      <w:r>
+        <w:rPr>
+          <w:b/>
+          <w:bCs/>
+          <w:lang w:val="en-CA"/>
+        </w:rPr>
+        <w:t>=True, text=True, timeout=3)</w:t>
+      </w:r>
+    </w:p>
+    <w:p>
+      <w:pPr>
+        <w:rPr>
+          <w:b/>
+          <w:bCs/>
+          <w:lang w:val="en-CA"/>
+        </w:rPr>
+      </w:pPr>
+      <w:r>
+        <w:rPr>
+          <w:b/>
+          <w:bCs/>
+          <w:lang w:val="en-CA"/>
+        </w:rPr>
+        <w:t xml:space="preserve">            if "0" in </w:t>
+      </w:r>
+      <w:proofErr w:type="spellStart"/>
+      <w:proofErr w:type="gramStart"/>
+      <w:r>
+        <w:rPr>
+          <w:b/>
+          <w:bCs/>
+          <w:lang w:val="en-CA"/>
+        </w:rPr>
+        <w:t>result.stdout</w:t>
+      </w:r>
+      <w:proofErr w:type="spellEnd"/>
+      <w:proofErr w:type="gramEnd"/>
+      <w:r>
+        <w:rPr>
+          <w:b/>
+          <w:bCs/>
+          <w:lang w:val="en-CA"/>
+        </w:rPr>
+        <w:t xml:space="preserve"> or "root" in </w:t>
+      </w:r>
+      <w:proofErr w:type="spellStart"/>
+      <w:r>
+        <w:rPr>
+          <w:b/>
+          <w:bCs/>
+          <w:lang w:val="en-CA"/>
+        </w:rPr>
+        <w:t>result.stdout</w:t>
+      </w:r>
+      <w:proofErr w:type="spellEnd"/>
+      <w:r>
+        <w:rPr>
+          <w:b/>
+          <w:bCs/>
+          <w:lang w:val="en-CA"/>
+        </w:rPr>
+        <w:t>:</w:t>
+      </w:r>
+    </w:p>
+    <w:p>
+      <w:pPr>
+        <w:rPr>
+          <w:b/>
+          <w:bCs/>
+          <w:lang w:val="en-CA"/>
+        </w:rPr>
+      </w:pPr>
+      <w:r>
+        <w:rPr>
+          <w:b/>
+          <w:bCs/>
+          <w:lang w:val="en-CA"/>
+        </w:rPr>
+        <w:lastRenderedPageBreak/>
+        <w:t xml:space="preserve">                return True</w:t>
+      </w:r>
+    </w:p>
+    <w:p>
+      <w:pPr>
+        <w:rPr>
+          <w:b/>
+          <w:bCs/>
+          <w:lang w:val="en-CA"/>
+        </w:rPr>
+      </w:pPr>
+      <w:r>
+        <w:rPr>
+          <w:b/>
+          <w:bCs/>
+          <w:lang w:val="en-CA"/>
+        </w:rPr>
+        <w:t xml:space="preserve">        except:</w:t>
+      </w:r>
+    </w:p>
+    <w:p>
+      <w:pPr>
+        <w:rPr>
+          <w:b/>
+          <w:bCs/>
+          <w:lang w:val="en-CA"/>
+        </w:rPr>
+      </w:pPr>
+      <w:r>
+        <w:rPr>
+          <w:b/>
+          <w:bCs/>
+          <w:lang w:val="en-CA"/>
+        </w:rPr>
+        <w:t xml:space="preserve">            continue</w:t>
+      </w:r>
+    </w:p>
+    <w:p>
+      <w:pPr>
+        <w:rPr>
+          <w:b/>
+          <w:bCs/>
+          <w:lang w:val="en-CA"/>
+        </w:rPr>
+      </w:pPr>
+      <w:r>
+        <w:rPr>
+          <w:b/>
+          <w:bCs/>
+          <w:lang w:val="en-CA"/>
+        </w:rPr>
+        <w:t xml:space="preserve">    return False</w:t>
+      </w:r>
+    </w:p>
+    <w:p>
+      <w:pPr>
+        <w:rPr>
+          <w:b/>
+          <w:bCs/>
+          <w:lang w:val="en-CA"/>
+        </w:rPr>
+      </w:pPr>
+      <w:r>
+        <w:rPr>
+          <w:b/>
+          <w:bCs/>
+          <w:lang w:val="en-CA"/>
+        </w:rPr>
+        <w:t>I recommended integrating all these checks into one function to improve reliability. You ran it but initially got inconsistent results on different emulator images.</w:t>
+      </w:r>
+    </w:p>
+    <w:p>
+      <w:pPr>
+        <w:rPr>
+          <w:b/>
+          <w:bCs/>
+          <w:lang w:val="en-CA"/>
+        </w:rPr>
+      </w:pPr>
     </w:p>
     <w:p>
       <w:pPr>
@@ -25395,7 +27104,6 @@
     <w:rsid w:val="00054B1C"/>
     <w:rsid w:val="000A1E7E"/>
     <w:rsid w:val="000E6CB6"/>
-    <w:rsid w:val="001203FD"/>
     <w:rsid w:val="0015567D"/>
     <w:rsid w:val="00174C32"/>
     <w:rsid w:val="00195082"/>
@@ -25403,6 +27111,7 @@
     <w:rsid w:val="001C312F"/>
     <w:rsid w:val="00201769"/>
     <w:rsid w:val="00211072"/>
+    <w:rsid w:val="003D1E76"/>
     <w:rsid w:val="003E6848"/>
     <w:rsid w:val="004A69F1"/>
     <w:rsid w:val="005016C6"/>

</xml_diff>